<commit_message>
fix: default resumes to two pages
</commit_message>
<xml_diff>
--- a/examples/applicant/templates/resume/template.docx
+++ b/examples/applicant/templates/resume/template.docx
@@ -48,7 +48,7 @@
         <w:rPr>
           <w:b/>
           <w:caps/>
-          <w:sz w:val="22"/>
+          <w:sz w:val="23"/>
         </w:rPr>
         <w:t xml:space="preserve">{{ section.title }}</w:t>
       </w:r>
@@ -80,14 +80,14 @@
     <w:p>
       <w:pPr>
         <w:tabs>
-          <w:tab w:pos="10224" w:val="right"/>
+          <w:tab w:pos="9360" w:val="right"/>
         </w:tabs>
         <w:spacing w:before="120" w:after="20"/>
       </w:pPr>
       <w:r>
         <w:rPr>
           <w:b/>
-          <w:sz w:val="22"/>
+          <w:sz w:val="23"/>
         </w:rPr>
         <w:t xml:space="preserve">{{ unit.head }}</w:t>
       </w:r>
@@ -151,7 +151,7 @@
     </w:p>
     <w:sectPr>
       <w:pgSz w:w="12240" w:h="15840"/>
-      <w:pgMar w:top="1008" w:right="1008" w:bottom="1008" w:left="1008" w:header="720" w:footer="720" w:gutter="0"/>
+      <w:pgMar w:top="1296" w:right="1440" w:bottom="1296" w:left="1440" w:header="720" w:footer="720" w:gutter="0"/>
       <w:cols w:space="720"/>
       <w:docGrid w:linePitch="360"/>
     </w:sectPr>
@@ -528,7 +528,7 @@
     <w:rPr>
       <w:rFonts w:ascii="Calibri" w:hAnsi="Calibri" w:eastAsia="Calibri"/>
       <w:color w:val="1F1F1F"/>
-      <w:sz w:val="21"/>
+      <w:sz w:val="22"/>
     </w:rPr>
   </w:style>
   <w:style w:type="paragraph" w:styleId="Header">

</xml_diff>